<commit_message>
Update Protokoll (Automatisch wiederhergestellt).docx
</commit_message>
<xml_diff>
--- a/Protokoll (Automatisch wiederhergestellt).docx
+++ b/Protokoll (Automatisch wiederhergestellt).docx
@@ -1372,6 +1372,25 @@
         <w:t>SELECT Abfragen:</w:t>
       </w:r>
     </w:p>
+    <w:p/>
+    <w:p>
+      <w:pPr>
+        <w:pStyle w:val="berschrift1"/>
+        <w:rPr>
+          <w:b/>
+          <w:bCs/>
+          <w:color w:val="000000" w:themeColor="text1"/>
+        </w:rPr>
+      </w:pPr>
+      <w:r>
+        <w:rPr>
+          <w:b/>
+          <w:bCs/>
+          <w:color w:val="000000" w:themeColor="text1"/>
+        </w:rPr>
+        <w:t>SQL Befehle Liste:</w:t>
+      </w:r>
+    </w:p>
     <w:p>
       <w:r>
         <w:t xml:space="preserve">CREATE TABLE </w:t>
@@ -1445,6 +1464,7 @@
         </w:rPr>
       </w:pPr>
       <w:r>
+        <w:lastRenderedPageBreak/>
         <w:t xml:space="preserve">  </w:t>
       </w:r>
       <w:r>
@@ -1490,433 +1510,1006 @@
         <w:rPr>
           <w:lang w:val="en-GB"/>
         </w:rPr>
+        <w:t xml:space="preserve">CREATE TABLE </w:t>
+      </w:r>
+      <w:proofErr w:type="spellStart"/>
+      <w:r>
+        <w:rPr>
+          <w:lang w:val="en-GB"/>
+        </w:rPr>
+        <w:t>händler</w:t>
+      </w:r>
+      <w:proofErr w:type="spellEnd"/>
+      <w:r>
+        <w:rPr>
+          <w:lang w:val="en-GB"/>
+        </w:rPr>
+        <w:t xml:space="preserve"> (</w:t>
+      </w:r>
+      <w:proofErr w:type="spellStart"/>
+      <w:r>
+        <w:rPr>
+          <w:lang w:val="en-GB"/>
+        </w:rPr>
+        <w:t>händler_id</w:t>
+      </w:r>
+      <w:proofErr w:type="spellEnd"/>
+      <w:r>
+        <w:rPr>
+          <w:lang w:val="en-GB"/>
+        </w:rPr>
+        <w:t xml:space="preserve"> INTEGER PRIMARY KEY AUTOINCREMENT);</w:t>
+      </w:r>
+    </w:p>
+    <w:p>
+      <w:pPr>
+        <w:rPr>
+          <w:lang w:val="en-GB"/>
+        </w:rPr>
+      </w:pPr>
+      <w:r>
+        <w:rPr>
+          <w:lang w:val="en-GB"/>
+        </w:rPr>
+        <w:t>INSERT INTO "</w:t>
+      </w:r>
+      <w:proofErr w:type="spellStart"/>
+      <w:r>
+        <w:rPr>
+          <w:lang w:val="en-GB"/>
+        </w:rPr>
+        <w:t>händler</w:t>
+      </w:r>
+      <w:proofErr w:type="spellEnd"/>
+      <w:r>
+        <w:rPr>
+          <w:lang w:val="en-GB"/>
+        </w:rPr>
+        <w:t xml:space="preserve">" </w:t>
+      </w:r>
+      <w:proofErr w:type="gramStart"/>
+      <w:r>
+        <w:rPr>
+          <w:lang w:val="en-GB"/>
+        </w:rPr>
+        <w:t>VALUES(</w:t>
+      </w:r>
+      <w:proofErr w:type="gramEnd"/>
+      <w:r>
+        <w:rPr>
+          <w:lang w:val="en-GB"/>
+        </w:rPr>
+        <w:t>1),</w:t>
+      </w:r>
+    </w:p>
+    <w:p>
+      <w:pPr>
+        <w:rPr>
+          <w:lang w:val="en-GB"/>
+        </w:rPr>
+      </w:pPr>
+      <w:r>
+        <w:rPr>
+          <w:lang w:val="en-GB"/>
+        </w:rPr>
+        <w:t xml:space="preserve">  (2);</w:t>
+      </w:r>
+    </w:p>
+    <w:p>
+      <w:pPr>
+        <w:rPr>
+          <w:lang w:val="en-GB"/>
+        </w:rPr>
+      </w:pPr>
+      <w:r>
+        <w:rPr>
+          <w:lang w:val="en-GB"/>
+        </w:rPr>
+        <w:t xml:space="preserve">CREATE TABLE </w:t>
+      </w:r>
+      <w:proofErr w:type="spellStart"/>
+      <w:r>
+        <w:rPr>
+          <w:lang w:val="en-GB"/>
+        </w:rPr>
+        <w:t>kunde</w:t>
+      </w:r>
+      <w:proofErr w:type="spellEnd"/>
+      <w:r>
+        <w:rPr>
+          <w:lang w:val="en-GB"/>
+        </w:rPr>
+        <w:t xml:space="preserve"> (</w:t>
+      </w:r>
+      <w:proofErr w:type="spellStart"/>
+      <w:r>
+        <w:rPr>
+          <w:lang w:val="en-GB"/>
+        </w:rPr>
+        <w:t>kunde_id</w:t>
+      </w:r>
+      <w:proofErr w:type="spellEnd"/>
+      <w:r>
+        <w:rPr>
+          <w:lang w:val="en-GB"/>
+        </w:rPr>
+        <w:t xml:space="preserve"> INTEGER PRIMARY KEY AUTOINCREMENT, </w:t>
+      </w:r>
+      <w:proofErr w:type="spellStart"/>
+      <w:r>
+        <w:rPr>
+          <w:lang w:val="en-GB"/>
+        </w:rPr>
+        <w:t>vorname</w:t>
+      </w:r>
+      <w:proofErr w:type="spellEnd"/>
+      <w:r>
+        <w:rPr>
+          <w:lang w:val="en-GB"/>
+        </w:rPr>
+        <w:t xml:space="preserve"> TEXT, </w:t>
+      </w:r>
+      <w:proofErr w:type="spellStart"/>
+      <w:r>
+        <w:rPr>
+          <w:lang w:val="en-GB"/>
+        </w:rPr>
+        <w:t>nachname</w:t>
+      </w:r>
+      <w:proofErr w:type="spellEnd"/>
+      <w:r>
+        <w:rPr>
+          <w:lang w:val="en-GB"/>
+        </w:rPr>
+        <w:t xml:space="preserve"> TEXT);</w:t>
+      </w:r>
+    </w:p>
+    <w:p>
+      <w:pPr>
+        <w:rPr>
+          <w:lang w:val="en-GB"/>
+        </w:rPr>
+      </w:pPr>
+      <w:r>
+        <w:rPr>
+          <w:lang w:val="en-GB"/>
+        </w:rPr>
+        <w:t xml:space="preserve">INSERT INTO </w:t>
+      </w:r>
+      <w:proofErr w:type="spellStart"/>
+      <w:r>
+        <w:rPr>
+          <w:lang w:val="en-GB"/>
+        </w:rPr>
+        <w:t>kunde</w:t>
+      </w:r>
+      <w:proofErr w:type="spellEnd"/>
+      <w:r>
+        <w:rPr>
+          <w:lang w:val="en-GB"/>
+        </w:rPr>
+        <w:t xml:space="preserve"> VALUES(1,'nevio','suleman'),</w:t>
+      </w:r>
+    </w:p>
+    <w:p>
+      <w:pPr>
+        <w:rPr>
+          <w:lang w:val="en-GB"/>
+        </w:rPr>
+      </w:pPr>
+      <w:r>
+        <w:rPr>
+          <w:lang w:val="en-GB"/>
+        </w:rPr>
+        <w:t xml:space="preserve">  (2,'rafael','busse');</w:t>
+      </w:r>
+    </w:p>
+    <w:p>
+      <w:pPr>
+        <w:rPr>
+          <w:lang w:val="en-GB"/>
+        </w:rPr>
+      </w:pPr>
+      <w:r>
+        <w:rPr>
+          <w:lang w:val="en-GB"/>
+        </w:rPr>
+        <w:t xml:space="preserve">CREATE TABLE </w:t>
+      </w:r>
+      <w:proofErr w:type="spellStart"/>
+      <w:r>
+        <w:rPr>
+          <w:lang w:val="en-GB"/>
+        </w:rPr>
+        <w:t>liefert</w:t>
+      </w:r>
+      <w:proofErr w:type="spellEnd"/>
+      <w:r>
+        <w:rPr>
+          <w:lang w:val="en-GB"/>
+        </w:rPr>
+        <w:t xml:space="preserve"> (</w:t>
+      </w:r>
+      <w:proofErr w:type="spellStart"/>
+      <w:r>
+        <w:rPr>
+          <w:lang w:val="en-GB"/>
+        </w:rPr>
+        <w:t>händler_id</w:t>
+      </w:r>
+      <w:proofErr w:type="spellEnd"/>
+      <w:r>
+        <w:rPr>
+          <w:lang w:val="en-GB"/>
+        </w:rPr>
+        <w:t xml:space="preserve"> INTEGER, </w:t>
+      </w:r>
+      <w:proofErr w:type="spellStart"/>
+      <w:r>
+        <w:rPr>
+          <w:lang w:val="en-GB"/>
+        </w:rPr>
+        <w:t>produkt_id</w:t>
+      </w:r>
+      <w:proofErr w:type="spellEnd"/>
+      <w:r>
+        <w:rPr>
+          <w:lang w:val="en-GB"/>
+        </w:rPr>
+        <w:t xml:space="preserve"> INTEGER, PRIMARY KEY (</w:t>
+      </w:r>
+      <w:proofErr w:type="spellStart"/>
+      <w:r>
+        <w:rPr>
+          <w:lang w:val="en-GB"/>
+        </w:rPr>
+        <w:t>händler_id</w:t>
+      </w:r>
+      <w:proofErr w:type="spellEnd"/>
+      <w:r>
+        <w:rPr>
+          <w:lang w:val="en-GB"/>
+        </w:rPr>
+        <w:t xml:space="preserve">, </w:t>
+      </w:r>
+      <w:proofErr w:type="spellStart"/>
+      <w:r>
+        <w:rPr>
+          <w:lang w:val="en-GB"/>
+        </w:rPr>
+        <w:t>produkt_id</w:t>
+      </w:r>
+      <w:proofErr w:type="spellEnd"/>
+      <w:r>
+        <w:rPr>
+          <w:lang w:val="en-GB"/>
+        </w:rPr>
+        <w:t>), FOREIGN KEY (</w:t>
+      </w:r>
+      <w:proofErr w:type="spellStart"/>
+      <w:r>
+        <w:rPr>
+          <w:lang w:val="en-GB"/>
+        </w:rPr>
+        <w:t>händler_id</w:t>
+      </w:r>
+      <w:proofErr w:type="spellEnd"/>
+      <w:r>
+        <w:rPr>
+          <w:lang w:val="en-GB"/>
+        </w:rPr>
+        <w:t xml:space="preserve">) REFERENCES </w:t>
+      </w:r>
+      <w:proofErr w:type="spellStart"/>
+      <w:r>
+        <w:rPr>
+          <w:lang w:val="en-GB"/>
+        </w:rPr>
+        <w:t>händler</w:t>
+      </w:r>
+      <w:proofErr w:type="spellEnd"/>
+      <w:r>
+        <w:rPr>
+          <w:lang w:val="en-GB"/>
+        </w:rPr>
+        <w:t>(</w:t>
+      </w:r>
+      <w:proofErr w:type="spellStart"/>
+      <w:r>
+        <w:rPr>
+          <w:lang w:val="en-GB"/>
+        </w:rPr>
+        <w:t>händler_id</w:t>
+      </w:r>
+      <w:proofErr w:type="spellEnd"/>
+      <w:r>
+        <w:rPr>
+          <w:lang w:val="en-GB"/>
+        </w:rPr>
+        <w:t>), FOREIGN KEY (</w:t>
+      </w:r>
+      <w:proofErr w:type="spellStart"/>
+      <w:r>
+        <w:rPr>
+          <w:lang w:val="en-GB"/>
+        </w:rPr>
+        <w:t>produkt_id</w:t>
+      </w:r>
+      <w:proofErr w:type="spellEnd"/>
+      <w:r>
+        <w:rPr>
+          <w:lang w:val="en-GB"/>
+        </w:rPr>
+        <w:t xml:space="preserve">) REFERENCES </w:t>
+      </w:r>
+      <w:proofErr w:type="spellStart"/>
+      <w:r>
+        <w:rPr>
+          <w:lang w:val="en-GB"/>
+        </w:rPr>
+        <w:t>produkt</w:t>
+      </w:r>
+      <w:proofErr w:type="spellEnd"/>
+      <w:r>
+        <w:rPr>
+          <w:lang w:val="en-GB"/>
+        </w:rPr>
+        <w:t>(</w:t>
+      </w:r>
+      <w:proofErr w:type="spellStart"/>
+      <w:r>
+        <w:rPr>
+          <w:lang w:val="en-GB"/>
+        </w:rPr>
+        <w:t>produkt_id</w:t>
+      </w:r>
+      <w:proofErr w:type="spellEnd"/>
+      <w:r>
+        <w:rPr>
+          <w:lang w:val="en-GB"/>
+        </w:rPr>
+        <w:t>));</w:t>
+      </w:r>
+    </w:p>
+    <w:p>
+      <w:pPr>
+        <w:rPr>
+          <w:lang w:val="en-GB"/>
+        </w:rPr>
+      </w:pPr>
+      <w:r>
+        <w:rPr>
+          <w:lang w:val="en-GB"/>
+        </w:rPr>
+        <w:t xml:space="preserve">INSERT INTO </w:t>
+      </w:r>
+      <w:proofErr w:type="spellStart"/>
+      <w:r>
+        <w:rPr>
+          <w:lang w:val="en-GB"/>
+        </w:rPr>
+        <w:t>liefert</w:t>
+      </w:r>
+      <w:proofErr w:type="spellEnd"/>
+      <w:r>
+        <w:rPr>
+          <w:lang w:val="en-GB"/>
+        </w:rPr>
+        <w:t xml:space="preserve"> </w:t>
+      </w:r>
+      <w:proofErr w:type="gramStart"/>
+      <w:r>
+        <w:rPr>
+          <w:lang w:val="en-GB"/>
+        </w:rPr>
+        <w:t>VALUES(</w:t>
+      </w:r>
+      <w:proofErr w:type="gramEnd"/>
+      <w:r>
+        <w:rPr>
+          <w:lang w:val="en-GB"/>
+        </w:rPr>
+        <w:t>1,1),</w:t>
+      </w:r>
+    </w:p>
+    <w:p>
+      <w:pPr>
+        <w:rPr>
+          <w:lang w:val="en-GB"/>
+        </w:rPr>
+      </w:pPr>
+      <w:r>
+        <w:rPr>
+          <w:lang w:val="en-GB"/>
+        </w:rPr>
+        <w:t xml:space="preserve">  (1,2),</w:t>
+      </w:r>
+    </w:p>
+    <w:p>
+      <w:pPr>
+        <w:rPr>
+          <w:lang w:val="en-GB"/>
+        </w:rPr>
+      </w:pPr>
+      <w:r>
+        <w:rPr>
+          <w:lang w:val="en-GB"/>
+        </w:rPr>
+        <w:t xml:space="preserve">  (2,3),</w:t>
+      </w:r>
+    </w:p>
+    <w:p>
+      <w:pPr>
+        <w:rPr>
+          <w:lang w:val="en-GB"/>
+        </w:rPr>
+      </w:pPr>
+      <w:r>
+        <w:rPr>
+          <w:lang w:val="en-GB"/>
+        </w:rPr>
+        <w:t xml:space="preserve">  (2,4);</w:t>
+      </w:r>
+    </w:p>
+    <w:p>
+      <w:pPr>
+        <w:rPr>
+          <w:lang w:val="en-GB"/>
+        </w:rPr>
+      </w:pPr>
+      <w:r>
+        <w:rPr>
+          <w:lang w:val="en-GB"/>
+        </w:rPr>
+        <w:t xml:space="preserve">CREATE TABLE </w:t>
+      </w:r>
+      <w:proofErr w:type="spellStart"/>
+      <w:r>
+        <w:rPr>
+          <w:lang w:val="en-GB"/>
+        </w:rPr>
+        <w:t>inventar</w:t>
+      </w:r>
+      <w:proofErr w:type="spellEnd"/>
+      <w:r>
+        <w:rPr>
+          <w:lang w:val="en-GB"/>
+        </w:rPr>
+        <w:t xml:space="preserve"> (</w:t>
+      </w:r>
+      <w:proofErr w:type="spellStart"/>
+      <w:r>
+        <w:rPr>
+          <w:lang w:val="en-GB"/>
+        </w:rPr>
+        <w:t>inventar_id</w:t>
+      </w:r>
+      <w:proofErr w:type="spellEnd"/>
+      <w:r>
+        <w:rPr>
+          <w:lang w:val="en-GB"/>
+        </w:rPr>
+        <w:t xml:space="preserve"> INTEGER PRIMARY KEY </w:t>
+      </w:r>
+      <w:proofErr w:type="spellStart"/>
+      <w:proofErr w:type="gramStart"/>
+      <w:r>
+        <w:rPr>
+          <w:lang w:val="en-GB"/>
+        </w:rPr>
+        <w:t>AUTOINCREMENT,lagerort</w:t>
+      </w:r>
+      <w:proofErr w:type="spellEnd"/>
+      <w:proofErr w:type="gramEnd"/>
+      <w:r>
+        <w:rPr>
+          <w:lang w:val="en-GB"/>
+        </w:rPr>
+        <w:t xml:space="preserve"> TEXT NOT </w:t>
+      </w:r>
+      <w:proofErr w:type="spellStart"/>
+      <w:proofErr w:type="gramStart"/>
+      <w:r>
+        <w:rPr>
+          <w:lang w:val="en-GB"/>
+        </w:rPr>
+        <w:t>NULL,bestand</w:t>
+      </w:r>
+      <w:proofErr w:type="spellEnd"/>
+      <w:proofErr w:type="gramEnd"/>
+      <w:r>
+        <w:rPr>
+          <w:lang w:val="en-GB"/>
+        </w:rPr>
+        <w:t xml:space="preserve"> INTEGER DEFAULT </w:t>
+      </w:r>
+      <w:proofErr w:type="gramStart"/>
+      <w:r>
+        <w:rPr>
+          <w:lang w:val="en-GB"/>
+        </w:rPr>
+        <w:t>0,produkt</w:t>
+      </w:r>
+      <w:proofErr w:type="gramEnd"/>
+      <w:r>
+        <w:rPr>
+          <w:lang w:val="en-GB"/>
+        </w:rPr>
+        <w:t xml:space="preserve">_id </w:t>
+      </w:r>
+      <w:proofErr w:type="gramStart"/>
+      <w:r>
+        <w:rPr>
+          <w:lang w:val="en-GB"/>
+        </w:rPr>
+        <w:t>INTEGER,FOREIGN</w:t>
+      </w:r>
+      <w:proofErr w:type="gramEnd"/>
+      <w:r>
+        <w:rPr>
+          <w:lang w:val="en-GB"/>
+        </w:rPr>
+        <w:t xml:space="preserve"> KEY (</w:t>
+      </w:r>
+      <w:proofErr w:type="spellStart"/>
+      <w:r>
+        <w:rPr>
+          <w:lang w:val="en-GB"/>
+        </w:rPr>
+        <w:t>produkt_id</w:t>
+      </w:r>
+      <w:proofErr w:type="spellEnd"/>
+      <w:r>
+        <w:rPr>
+          <w:lang w:val="en-GB"/>
+        </w:rPr>
+        <w:t xml:space="preserve">) REFERENCES </w:t>
+      </w:r>
+      <w:proofErr w:type="spellStart"/>
+      <w:r>
+        <w:rPr>
+          <w:lang w:val="en-GB"/>
+        </w:rPr>
+        <w:t>produkt</w:t>
+      </w:r>
+      <w:proofErr w:type="spellEnd"/>
+      <w:r>
+        <w:rPr>
+          <w:lang w:val="en-GB"/>
+        </w:rPr>
+        <w:t>(</w:t>
+      </w:r>
+      <w:proofErr w:type="spellStart"/>
+      <w:r>
+        <w:rPr>
+          <w:lang w:val="en-GB"/>
+        </w:rPr>
+        <w:t>produkt_id</w:t>
+      </w:r>
+      <w:proofErr w:type="spellEnd"/>
+      <w:r>
+        <w:rPr>
+          <w:lang w:val="en-GB"/>
+        </w:rPr>
+        <w:t>));</w:t>
+      </w:r>
+    </w:p>
+    <w:p>
+      <w:pPr>
+        <w:rPr>
+          <w:lang w:val="en-GB"/>
+        </w:rPr>
+      </w:pPr>
+      <w:r>
+        <w:rPr>
+          <w:lang w:val="en-GB"/>
+        </w:rPr>
+        <w:t xml:space="preserve">INSERT INTO </w:t>
+      </w:r>
+      <w:proofErr w:type="spellStart"/>
+      <w:r>
+        <w:rPr>
+          <w:lang w:val="en-GB"/>
+        </w:rPr>
+        <w:t>inventar</w:t>
+      </w:r>
+      <w:proofErr w:type="spellEnd"/>
+      <w:r>
+        <w:rPr>
+          <w:lang w:val="en-GB"/>
+        </w:rPr>
+        <w:t xml:space="preserve"> VALUES(1,'verkaufsregal',15,1),</w:t>
+      </w:r>
+    </w:p>
+    <w:p>
+      <w:pPr>
+        <w:rPr>
+          <w:lang w:val="en-GB"/>
+        </w:rPr>
+      </w:pPr>
+      <w:r>
+        <w:rPr>
+          <w:lang w:val="en-GB"/>
+        </w:rPr>
+        <w:t xml:space="preserve">  (2,'kartons',12,2),</w:t>
+      </w:r>
+    </w:p>
+    <w:p>
+      <w:pPr>
+        <w:rPr>
+          <w:lang w:val="en-GB"/>
+        </w:rPr>
+      </w:pPr>
+      <w:r>
+        <w:rPr>
+          <w:lang w:val="en-GB"/>
+        </w:rPr>
+        <w:t xml:space="preserve">  (3,'theke',5,3),</w:t>
+      </w:r>
+    </w:p>
+    <w:p>
+      <w:pPr>
+        <w:rPr>
+          <w:lang w:val="en-GB"/>
+        </w:rPr>
+      </w:pPr>
+      <w:r>
+        <w:rPr>
+          <w:lang w:val="en-GB"/>
+        </w:rPr>
+        <w:t xml:space="preserve">  (4,'hinterlager',20,4);</w:t>
+      </w:r>
+    </w:p>
+    <w:p>
+      <w:pPr>
+        <w:rPr>
+          <w:lang w:val="en-GB"/>
+        </w:rPr>
+      </w:pPr>
+      <w:r>
+        <w:rPr>
+          <w:lang w:val="en-GB"/>
+        </w:rPr>
+        <w:t>CREATE TABLE IF NOT EXISTS "</w:t>
+      </w:r>
+      <w:proofErr w:type="spellStart"/>
+      <w:r>
+        <w:rPr>
+          <w:lang w:val="en-GB"/>
+        </w:rPr>
+        <w:t>kauft</w:t>
+      </w:r>
+      <w:proofErr w:type="spellEnd"/>
+      <w:r>
+        <w:rPr>
+          <w:lang w:val="en-GB"/>
+        </w:rPr>
+        <w:t>" (</w:t>
+      </w:r>
+      <w:proofErr w:type="spellStart"/>
+      <w:r>
+        <w:rPr>
+          <w:lang w:val="en-GB"/>
+        </w:rPr>
+        <w:t>kunde_id</w:t>
+      </w:r>
+      <w:proofErr w:type="spellEnd"/>
+      <w:r>
+        <w:rPr>
+          <w:lang w:val="en-GB"/>
+        </w:rPr>
+        <w:t xml:space="preserve"> INTEGER, </w:t>
+      </w:r>
+      <w:proofErr w:type="spellStart"/>
+      <w:r>
+        <w:rPr>
+          <w:lang w:val="en-GB"/>
+        </w:rPr>
+        <w:t>produkt_id</w:t>
+      </w:r>
+      <w:proofErr w:type="spellEnd"/>
+      <w:r>
+        <w:rPr>
+          <w:lang w:val="en-GB"/>
+        </w:rPr>
+        <w:t xml:space="preserve"> INTEGER, </w:t>
+      </w:r>
+      <w:proofErr w:type="spellStart"/>
+      <w:r>
+        <w:rPr>
+          <w:lang w:val="en-GB"/>
+        </w:rPr>
+        <w:t>produktanzahl</w:t>
+      </w:r>
+      <w:proofErr w:type="spellEnd"/>
+      <w:r>
+        <w:rPr>
+          <w:lang w:val="en-GB"/>
+        </w:rPr>
+        <w:t xml:space="preserve"> INTEGER NOT NULL, PRIMARY </w:t>
+      </w:r>
+      <w:proofErr w:type="gramStart"/>
+      <w:r>
+        <w:rPr>
+          <w:lang w:val="en-GB"/>
+        </w:rPr>
+        <w:t>KEY(</w:t>
+      </w:r>
+      <w:proofErr w:type="spellStart"/>
+      <w:proofErr w:type="gramEnd"/>
+      <w:r>
+        <w:rPr>
+          <w:lang w:val="en-GB"/>
+        </w:rPr>
+        <w:t>kunde_id</w:t>
+      </w:r>
+      <w:proofErr w:type="spellEnd"/>
+      <w:r>
+        <w:rPr>
+          <w:lang w:val="en-GB"/>
+        </w:rPr>
+        <w:t xml:space="preserve">, </w:t>
+      </w:r>
+      <w:proofErr w:type="spellStart"/>
+      <w:r>
+        <w:rPr>
+          <w:lang w:val="en-GB"/>
+        </w:rPr>
+        <w:t>produkt_id</w:t>
+      </w:r>
+      <w:proofErr w:type="spellEnd"/>
+      <w:r>
+        <w:rPr>
+          <w:lang w:val="en-GB"/>
+        </w:rPr>
+        <w:t>), FOREIGN KEY (</w:t>
+      </w:r>
+      <w:proofErr w:type="spellStart"/>
+      <w:r>
+        <w:rPr>
+          <w:lang w:val="en-GB"/>
+        </w:rPr>
+        <w:t>kunde_id</w:t>
+      </w:r>
+      <w:proofErr w:type="spellEnd"/>
+      <w:r>
+        <w:rPr>
+          <w:lang w:val="en-GB"/>
+        </w:rPr>
+        <w:t xml:space="preserve">) REFERENCES </w:t>
+      </w:r>
+      <w:proofErr w:type="spellStart"/>
+      <w:r>
+        <w:rPr>
+          <w:lang w:val="en-GB"/>
+        </w:rPr>
+        <w:t>kunde</w:t>
+      </w:r>
+      <w:proofErr w:type="spellEnd"/>
+      <w:r>
+        <w:rPr>
+          <w:lang w:val="en-GB"/>
+        </w:rPr>
+        <w:t>(</w:t>
+      </w:r>
+      <w:proofErr w:type="spellStart"/>
+      <w:r>
+        <w:rPr>
+          <w:lang w:val="en-GB"/>
+        </w:rPr>
+        <w:t>kunde_id</w:t>
+      </w:r>
+      <w:proofErr w:type="spellEnd"/>
+      <w:r>
+        <w:rPr>
+          <w:lang w:val="en-GB"/>
+        </w:rPr>
+        <w:t>), FOREIGN KEY (</w:t>
+      </w:r>
+      <w:proofErr w:type="spellStart"/>
+      <w:r>
+        <w:rPr>
+          <w:lang w:val="en-GB"/>
+        </w:rPr>
+        <w:t>produkt_id</w:t>
+      </w:r>
+      <w:proofErr w:type="spellEnd"/>
+      <w:r>
+        <w:rPr>
+          <w:lang w:val="en-GB"/>
+        </w:rPr>
+        <w:t xml:space="preserve">) REFERENCES </w:t>
+      </w:r>
+      <w:proofErr w:type="spellStart"/>
+      <w:r>
+        <w:rPr>
+          <w:lang w:val="en-GB"/>
+        </w:rPr>
+        <w:t>produkt</w:t>
+      </w:r>
+      <w:proofErr w:type="spellEnd"/>
+      <w:r>
+        <w:rPr>
+          <w:lang w:val="en-GB"/>
+        </w:rPr>
+        <w:t>(</w:t>
+      </w:r>
+      <w:proofErr w:type="spellStart"/>
+      <w:r>
+        <w:rPr>
+          <w:lang w:val="en-GB"/>
+        </w:rPr>
+        <w:t>produkt_id</w:t>
+      </w:r>
+      <w:proofErr w:type="spellEnd"/>
+      <w:r>
+        <w:rPr>
+          <w:lang w:val="en-GB"/>
+        </w:rPr>
+        <w:t>));</w:t>
+      </w:r>
+    </w:p>
+    <w:p>
+      <w:pPr>
+        <w:rPr>
+          <w:lang w:val="en-GB"/>
+        </w:rPr>
+      </w:pPr>
+      <w:r>
+        <w:rPr>
+          <w:lang w:val="en-GB"/>
+        </w:rPr>
+        <w:t xml:space="preserve">INSERT INTO </w:t>
+      </w:r>
+      <w:proofErr w:type="spellStart"/>
+      <w:r>
+        <w:rPr>
+          <w:lang w:val="en-GB"/>
+        </w:rPr>
+        <w:t>kauft</w:t>
+      </w:r>
+      <w:proofErr w:type="spellEnd"/>
+      <w:r>
+        <w:rPr>
+          <w:lang w:val="en-GB"/>
+        </w:rPr>
+        <w:t xml:space="preserve"> </w:t>
+      </w:r>
+      <w:proofErr w:type="gramStart"/>
+      <w:r>
+        <w:rPr>
+          <w:lang w:val="en-GB"/>
+        </w:rPr>
+        <w:t>VALUES(</w:t>
+      </w:r>
+      <w:proofErr w:type="gramEnd"/>
+      <w:r>
+        <w:rPr>
+          <w:lang w:val="en-GB"/>
+        </w:rPr>
+        <w:t>1,2,1),</w:t>
+      </w:r>
+    </w:p>
+    <w:p>
+      <w:pPr>
+        <w:rPr>
+          <w:lang w:val="en-GB"/>
+        </w:rPr>
+      </w:pPr>
+      <w:r>
+        <w:rPr>
+          <w:lang w:val="en-GB"/>
+        </w:rPr>
+        <w:t xml:space="preserve">  (1,3,3),</w:t>
+      </w:r>
+    </w:p>
+    <w:p>
+      <w:pPr>
+        <w:rPr>
+          <w:lang w:val="en-GB"/>
+        </w:rPr>
+      </w:pPr>
+      <w:r>
+        <w:rPr>
+          <w:lang w:val="en-GB"/>
+        </w:rPr>
+        <w:t xml:space="preserve">  (1,4,1),</w:t>
+      </w:r>
+    </w:p>
+    <w:p>
+      <w:pPr>
+        <w:rPr>
+          <w:lang w:val="en-GB"/>
+        </w:rPr>
+      </w:pPr>
+      <w:r>
+        <w:rPr>
+          <w:lang w:val="en-GB"/>
+        </w:rPr>
         <w:lastRenderedPageBreak/>
-        <w:t>CREATE TABLE händler (händler_id INTEGER PRIMARY KEY AUTOINCREMENT);</w:t>
-      </w:r>
-    </w:p>
-    <w:p>
-      <w:pPr>
-        <w:rPr>
-          <w:lang w:val="en-GB"/>
-        </w:rPr>
-      </w:pPr>
-      <w:r>
-        <w:rPr>
-          <w:lang w:val="en-GB"/>
-        </w:rPr>
-        <w:t xml:space="preserve">INSERT INTO "händler" </w:t>
-      </w:r>
+        <w:t xml:space="preserve">  (2,1,1),</w:t>
+      </w:r>
+    </w:p>
+    <w:p>
+      <w:pPr>
+        <w:rPr>
+          <w:lang w:val="en-GB"/>
+        </w:rPr>
+      </w:pPr>
+      <w:r>
+        <w:rPr>
+          <w:lang w:val="en-GB"/>
+        </w:rPr>
+        <w:t xml:space="preserve">  (2,2,1);</w:t>
+      </w:r>
+    </w:p>
+    <w:p>
+      <w:pPr>
+        <w:rPr>
+          <w:lang w:val="en-GB"/>
+        </w:rPr>
+      </w:pPr>
+      <w:r>
+        <w:rPr>
+          <w:lang w:val="en-GB"/>
+        </w:rPr>
+        <w:t xml:space="preserve">PRAGMA </w:t>
+      </w:r>
+      <w:proofErr w:type="spellStart"/>
+      <w:r>
+        <w:rPr>
+          <w:lang w:val="en-GB"/>
+        </w:rPr>
+        <w:t>writable_schema</w:t>
+      </w:r>
+      <w:proofErr w:type="spellEnd"/>
+      <w:r>
+        <w:rPr>
+          <w:lang w:val="en-GB"/>
+        </w:rPr>
+        <w:t>=ON;</w:t>
+      </w:r>
+    </w:p>
+    <w:p>
+      <w:pPr>
+        <w:rPr>
+          <w:lang w:val="en-GB"/>
+        </w:rPr>
+      </w:pPr>
+      <w:r>
+        <w:rPr>
+          <w:lang w:val="en-GB"/>
+        </w:rPr>
+        <w:t xml:space="preserve">CREATE TABLE IF NOT EXISTS </w:t>
+      </w:r>
+      <w:proofErr w:type="spellStart"/>
+      <w:r>
+        <w:rPr>
+          <w:lang w:val="en-GB"/>
+        </w:rPr>
+        <w:t>sqlite_sequence</w:t>
+      </w:r>
+      <w:proofErr w:type="spellEnd"/>
+      <w:r>
+        <w:rPr>
+          <w:lang w:val="en-GB"/>
+        </w:rPr>
+        <w:t>(</w:t>
+      </w:r>
+      <w:proofErr w:type="spellStart"/>
       <w:proofErr w:type="gramStart"/>
       <w:r>
         <w:rPr>
           <w:lang w:val="en-GB"/>
         </w:rPr>
-        <w:t>VALUES(</w:t>
-      </w:r>
+        <w:t>name,seq</w:t>
+      </w:r>
+      <w:proofErr w:type="spellEnd"/>
       <w:proofErr w:type="gramEnd"/>
       <w:r>
         <w:rPr>
           <w:lang w:val="en-GB"/>
         </w:rPr>
-        <w:t>1),</w:t>
-      </w:r>
-    </w:p>
-    <w:p>
-      <w:pPr>
-        <w:rPr>
-          <w:lang w:val="en-GB"/>
-        </w:rPr>
-      </w:pPr>
-      <w:r>
-        <w:rPr>
-          <w:lang w:val="en-GB"/>
-        </w:rPr>
-        <w:t xml:space="preserve">  (2);</w:t>
-      </w:r>
-    </w:p>
-    <w:p>
-      <w:pPr>
-        <w:rPr>
-          <w:lang w:val="en-GB"/>
-        </w:rPr>
-      </w:pPr>
-      <w:r>
-        <w:rPr>
-          <w:lang w:val="en-GB"/>
-        </w:rPr>
-        <w:t>CREATE TABLE kunde (kunde_id INTEGER PRIMARY KEY AUTOINCREMENT, vorname TEXT, nachname TEXT);</w:t>
-      </w:r>
-    </w:p>
-    <w:p>
-      <w:pPr>
-        <w:rPr>
-          <w:lang w:val="en-GB"/>
-        </w:rPr>
-      </w:pPr>
-      <w:r>
-        <w:rPr>
-          <w:lang w:val="en-GB"/>
-        </w:rPr>
-        <w:t>INSERT INTO kunde VALUES(1,'nevio','suleman'),</w:t>
-      </w:r>
-    </w:p>
-    <w:p>
-      <w:pPr>
-        <w:rPr>
-          <w:lang w:val="en-GB"/>
-        </w:rPr>
-      </w:pPr>
-      <w:r>
-        <w:rPr>
-          <w:lang w:val="en-GB"/>
-        </w:rPr>
-        <w:t xml:space="preserve">  (2,'rafael','busse');</w:t>
-      </w:r>
-    </w:p>
-    <w:p>
-      <w:pPr>
-        <w:rPr>
-          <w:lang w:val="en-GB"/>
-        </w:rPr>
-      </w:pPr>
-      <w:r>
-        <w:rPr>
-          <w:lang w:val="en-GB"/>
-        </w:rPr>
-        <w:t>CREATE TABLE liefert (händler_id INTEGER, produkt_id INTEGER, PRIMARY KEY (händler_id, produkt_id), FOREIGN KEY (händler_id) REFERENCES händler(händler_id), FOREIGN KEY (produkt_id) REFERENCES produkt(produkt_id));</w:t>
-      </w:r>
-    </w:p>
-    <w:p>
-      <w:pPr>
-        <w:rPr>
-          <w:lang w:val="en-GB"/>
-        </w:rPr>
-      </w:pPr>
-      <w:r>
-        <w:rPr>
-          <w:lang w:val="en-GB"/>
-        </w:rPr>
-        <w:t xml:space="preserve">INSERT INTO liefert </w:t>
-      </w:r>
-      <w:proofErr w:type="gramStart"/>
-      <w:r>
-        <w:rPr>
-          <w:lang w:val="en-GB"/>
-        </w:rPr>
-        <w:t>VALUES(</w:t>
-      </w:r>
-      <w:proofErr w:type="gramEnd"/>
-      <w:r>
-        <w:rPr>
-          <w:lang w:val="en-GB"/>
-        </w:rPr>
-        <w:t>1,1),</w:t>
-      </w:r>
-    </w:p>
-    <w:p>
-      <w:pPr>
-        <w:rPr>
-          <w:lang w:val="en-GB"/>
-        </w:rPr>
-      </w:pPr>
-      <w:r>
-        <w:rPr>
-          <w:lang w:val="en-GB"/>
-        </w:rPr>
-        <w:t xml:space="preserve">  (1,2),</w:t>
-      </w:r>
-    </w:p>
-    <w:p>
-      <w:pPr>
-        <w:rPr>
-          <w:lang w:val="en-GB"/>
-        </w:rPr>
-      </w:pPr>
-      <w:r>
-        <w:rPr>
-          <w:lang w:val="en-GB"/>
-        </w:rPr>
-        <w:t xml:space="preserve">  (2,3),</w:t>
-      </w:r>
-    </w:p>
-    <w:p>
-      <w:pPr>
-        <w:rPr>
-          <w:lang w:val="en-GB"/>
-        </w:rPr>
-      </w:pPr>
-      <w:r>
-        <w:rPr>
-          <w:lang w:val="en-GB"/>
-        </w:rPr>
-        <w:t xml:space="preserve">  (2,4);</w:t>
-      </w:r>
-    </w:p>
-    <w:p>
-      <w:pPr>
-        <w:rPr>
-          <w:lang w:val="en-GB"/>
-        </w:rPr>
-      </w:pPr>
-      <w:r>
-        <w:rPr>
-          <w:lang w:val="en-GB"/>
-        </w:rPr>
-        <w:t xml:space="preserve">CREATE TABLE inventar (inventar_id INTEGER PRIMARY KEY </w:t>
-      </w:r>
-      <w:proofErr w:type="gramStart"/>
-      <w:r>
-        <w:rPr>
-          <w:lang w:val="en-GB"/>
-        </w:rPr>
-        <w:t>AUTOINCREMENT,lagerort</w:t>
-      </w:r>
-      <w:proofErr w:type="gramEnd"/>
-      <w:r>
-        <w:rPr>
-          <w:lang w:val="en-GB"/>
-        </w:rPr>
-        <w:t xml:space="preserve"> TEXT NOT </w:t>
-      </w:r>
-      <w:proofErr w:type="gramStart"/>
-      <w:r>
-        <w:rPr>
-          <w:lang w:val="en-GB"/>
-        </w:rPr>
-        <w:t>NULL,bestand</w:t>
-      </w:r>
-      <w:proofErr w:type="gramEnd"/>
-      <w:r>
-        <w:rPr>
-          <w:lang w:val="en-GB"/>
-        </w:rPr>
-        <w:t xml:space="preserve"> INTEGER DEFAULT </w:t>
-      </w:r>
-      <w:proofErr w:type="gramStart"/>
-      <w:r>
-        <w:rPr>
-          <w:lang w:val="en-GB"/>
-        </w:rPr>
-        <w:t>0,produkt</w:t>
-      </w:r>
-      <w:proofErr w:type="gramEnd"/>
-      <w:r>
-        <w:rPr>
-          <w:lang w:val="en-GB"/>
-        </w:rPr>
-        <w:t xml:space="preserve">_id </w:t>
-      </w:r>
-      <w:proofErr w:type="gramStart"/>
-      <w:r>
-        <w:rPr>
-          <w:lang w:val="en-GB"/>
-        </w:rPr>
-        <w:t>INTEGER,FOREIGN</w:t>
-      </w:r>
-      <w:proofErr w:type="gramEnd"/>
-      <w:r>
-        <w:rPr>
-          <w:lang w:val="en-GB"/>
-        </w:rPr>
-        <w:t xml:space="preserve"> KEY (produkt_id) REFERENCES produkt(produkt_id));</w:t>
-      </w:r>
-    </w:p>
-    <w:p>
-      <w:pPr>
-        <w:rPr>
-          <w:lang w:val="en-GB"/>
-        </w:rPr>
-      </w:pPr>
-      <w:r>
-        <w:rPr>
-          <w:lang w:val="en-GB"/>
-        </w:rPr>
-        <w:t>INSERT INTO inventar VALUES(1,'verkaufsregal',15,1),</w:t>
-      </w:r>
-    </w:p>
-    <w:p>
-      <w:pPr>
-        <w:rPr>
-          <w:lang w:val="en-GB"/>
-        </w:rPr>
-      </w:pPr>
-      <w:r>
-        <w:rPr>
-          <w:lang w:val="en-GB"/>
-        </w:rPr>
-        <w:t xml:space="preserve">  (2,'kartons',12,2),</w:t>
-      </w:r>
-    </w:p>
-    <w:p>
-      <w:pPr>
-        <w:rPr>
-          <w:lang w:val="en-GB"/>
-        </w:rPr>
-      </w:pPr>
-      <w:r>
-        <w:rPr>
-          <w:lang w:val="en-GB"/>
-        </w:rPr>
-        <w:t xml:space="preserve">  (3,'theke',5,3),</w:t>
-      </w:r>
-    </w:p>
-    <w:p>
-      <w:pPr>
-        <w:rPr>
-          <w:lang w:val="en-GB"/>
-        </w:rPr>
-      </w:pPr>
-      <w:r>
-        <w:rPr>
-          <w:lang w:val="en-GB"/>
-        </w:rPr>
-        <w:t xml:space="preserve">  (4,'hinterlager',20,4);</w:t>
-      </w:r>
-    </w:p>
-    <w:p>
-      <w:pPr>
-        <w:rPr>
-          <w:lang w:val="en-GB"/>
-        </w:rPr>
-      </w:pPr>
-      <w:r>
-        <w:rPr>
-          <w:lang w:val="en-GB"/>
-        </w:rPr>
-        <w:t xml:space="preserve">CREATE TABLE IF NOT EXISTS "kauft" (kunde_id INTEGER, produkt_id INTEGER, produktanzahl INTEGER NOT NULL, PRIMARY </w:t>
-      </w:r>
-      <w:proofErr w:type="gramStart"/>
-      <w:r>
-        <w:rPr>
-          <w:lang w:val="en-GB"/>
-        </w:rPr>
-        <w:t>KEY(</w:t>
-      </w:r>
-      <w:proofErr w:type="gramEnd"/>
-      <w:r>
-        <w:rPr>
-          <w:lang w:val="en-GB"/>
-        </w:rPr>
-        <w:t>kunde_id, produkt_id), FOREIGN KEY (kunde_id) REFERENCES kunde(kunde_id), FOREIGN KEY (produkt_id) REFERENCES produkt(produkt_id));</w:t>
-      </w:r>
-    </w:p>
-    <w:p>
-      <w:pPr>
-        <w:rPr>
-          <w:lang w:val="en-GB"/>
-        </w:rPr>
-      </w:pPr>
-      <w:r>
-        <w:rPr>
-          <w:lang w:val="en-GB"/>
-        </w:rPr>
-        <w:t xml:space="preserve">INSERT INTO kauft </w:t>
-      </w:r>
-      <w:proofErr w:type="gramStart"/>
-      <w:r>
-        <w:rPr>
-          <w:lang w:val="en-GB"/>
-        </w:rPr>
-        <w:t>VALUES(</w:t>
-      </w:r>
-      <w:proofErr w:type="gramEnd"/>
-      <w:r>
-        <w:rPr>
-          <w:lang w:val="en-GB"/>
-        </w:rPr>
-        <w:t>1,2,1),</w:t>
-      </w:r>
-    </w:p>
-    <w:p>
-      <w:pPr>
-        <w:rPr>
-          <w:lang w:val="en-GB"/>
-        </w:rPr>
-      </w:pPr>
-      <w:r>
-        <w:rPr>
-          <w:lang w:val="en-GB"/>
-        </w:rPr>
-        <w:t xml:space="preserve">  (1,3,3),</w:t>
-      </w:r>
-    </w:p>
-    <w:p>
-      <w:pPr>
-        <w:rPr>
-          <w:lang w:val="en-GB"/>
-        </w:rPr>
-      </w:pPr>
-      <w:r>
-        <w:rPr>
-          <w:lang w:val="en-GB"/>
-        </w:rPr>
-        <w:t xml:space="preserve">  (1,4,1),</w:t>
-      </w:r>
-    </w:p>
-    <w:p>
-      <w:pPr>
-        <w:rPr>
-          <w:lang w:val="en-GB"/>
-        </w:rPr>
-      </w:pPr>
-      <w:r>
-        <w:rPr>
-          <w:lang w:val="en-GB"/>
-        </w:rPr>
-        <w:t xml:space="preserve">  (2,1,1),</w:t>
-      </w:r>
-    </w:p>
-    <w:p>
-      <w:pPr>
-        <w:rPr>
-          <w:lang w:val="en-GB"/>
-        </w:rPr>
-      </w:pPr>
-      <w:r>
-        <w:rPr>
-          <w:lang w:val="en-GB"/>
-        </w:rPr>
-        <w:t xml:space="preserve">  (2,2,1);</w:t>
-      </w:r>
-    </w:p>
-    <w:p>
-      <w:pPr>
-        <w:rPr>
-          <w:lang w:val="en-GB"/>
-        </w:rPr>
-      </w:pPr>
-      <w:r>
-        <w:rPr>
-          <w:lang w:val="en-GB"/>
-        </w:rPr>
-        <w:t>PRAGMA writable_schema=ON;</w:t>
-      </w:r>
-    </w:p>
-    <w:p>
-      <w:pPr>
-        <w:rPr>
-          <w:lang w:val="en-GB"/>
-        </w:rPr>
-      </w:pPr>
-      <w:r>
-        <w:rPr>
-          <w:lang w:val="en-GB"/>
-        </w:rPr>
-        <w:lastRenderedPageBreak/>
-        <w:t>CREATE TABLE IF NOT EXISTS sqlite_sequence(</w:t>
-      </w:r>
-      <w:proofErr w:type="gramStart"/>
-      <w:r>
-        <w:rPr>
-          <w:lang w:val="en-GB"/>
-        </w:rPr>
-        <w:t>name,seq</w:t>
-      </w:r>
-      <w:proofErr w:type="gramEnd"/>
-      <w:r>
-        <w:rPr>
-          <w:lang w:val="en-GB"/>
-        </w:rPr>
         <w:t>);</w:t>
       </w:r>
     </w:p>
@@ -1930,20 +2523,48 @@
         <w:rPr>
           <w:lang w:val="en-GB"/>
         </w:rPr>
-        <w:t>DELETE FROM sqlite_sequence;</w:t>
-      </w:r>
-    </w:p>
-    <w:p>
-      <w:pPr>
-        <w:rPr>
-          <w:lang w:val="en-GB"/>
-        </w:rPr>
-      </w:pPr>
-      <w:r>
-        <w:rPr>
-          <w:lang w:val="en-GB"/>
-        </w:rPr>
-        <w:t>INSERT INTO sqlite_sequence VALUES('produkt',4),</w:t>
+        <w:t xml:space="preserve">DELETE FROM </w:t>
+      </w:r>
+      <w:proofErr w:type="spellStart"/>
+      <w:r>
+        <w:rPr>
+          <w:lang w:val="en-GB"/>
+        </w:rPr>
+        <w:t>sqlite_sequence</w:t>
+      </w:r>
+      <w:proofErr w:type="spellEnd"/>
+      <w:r>
+        <w:rPr>
+          <w:lang w:val="en-GB"/>
+        </w:rPr>
+        <w:t>;</w:t>
+      </w:r>
+    </w:p>
+    <w:p>
+      <w:pPr>
+        <w:rPr>
+          <w:lang w:val="en-GB"/>
+        </w:rPr>
+      </w:pPr>
+      <w:r>
+        <w:rPr>
+          <w:lang w:val="en-GB"/>
+        </w:rPr>
+        <w:t xml:space="preserve">INSERT INTO </w:t>
+      </w:r>
+      <w:proofErr w:type="spellStart"/>
+      <w:r>
+        <w:rPr>
+          <w:lang w:val="en-GB"/>
+        </w:rPr>
+        <w:t>sqlite_sequence</w:t>
+      </w:r>
+      <w:proofErr w:type="spellEnd"/>
+      <w:r>
+        <w:rPr>
+          <w:lang w:val="en-GB"/>
+        </w:rPr>
+        <w:t xml:space="preserve"> VALUES('produkt',4),</w:t>
       </w:r>
     </w:p>
     <w:p>
@@ -1980,6 +2601,7 @@
         <w:t>=OFF;</w:t>
       </w:r>
     </w:p>
+    <w:p/>
     <w:sectPr>
       <w:pgSz w:w="11906" w:h="16838"/>
       <w:pgMar w:top="1417" w:right="1417" w:bottom="1134" w:left="1417" w:header="708" w:footer="708" w:gutter="0"/>

</xml_diff>